<commit_message>
add: aggiunto document inteface specification NotificheService
</commit_message>
<xml_diff>
--- a/Workspace/ODD/punti singoli/Interface specification - Access.docx
+++ b/Workspace/ODD/punti singoli/Interface specification - Access.docx
@@ -2,154 +2,6 @@
 <file path=word/document.xml><?xml version="1.0" encoding="utf-8"?>
 <w:document xmlns:wpc="http://schemas.microsoft.com/office/word/2010/wordprocessingCanvas" xmlns:cx="http://schemas.microsoft.com/office/drawing/2014/chartex" xmlns:cx1="http://schemas.microsoft.com/office/drawing/2015/9/8/chartex" xmlns:cx2="http://schemas.microsoft.com/office/drawing/2015/10/21/chartex" xmlns:cx3="http://schemas.microsoft.com/office/drawing/2016/5/9/chartex" xmlns:cx4="http://schemas.microsoft.com/office/drawing/2016/5/10/chartex" xmlns:cx5="http://schemas.microsoft.com/office/drawing/2016/5/11/chartex" xmlns:cx6="http://schemas.microsoft.com/office/drawing/2016/5/12/chartex" xmlns:cx7="http://schemas.microsoft.com/office/drawing/2016/5/13/chartex" xmlns:cx8="http://schemas.microsoft.com/office/drawing/2016/5/14/chartex" xmlns:mc="http://schemas.openxmlformats.org/markup-compatibility/2006" xmlns:aink="http://schemas.microsoft.com/office/drawing/2016/ink" xmlns:am3d="http://schemas.microsoft.com/office/drawing/2017/model3d" xmlns:o="urn:schemas-microsoft-com:office:office" xmlns:oel="http://schemas.microsoft.com/office/2019/extlst" xmlns:r="http://schemas.openxmlformats.org/officeDocument/2006/relationships" xmlns:m="http://schemas.openxmlformats.org/officeDocument/2006/math" xmlns:v="urn:schemas-microsoft-com:vml" xmlns:wp14="http://schemas.microsoft.com/office/word/2010/wordprocessingDrawing" xmlns:wp="http://schemas.openxmlformats.org/drawingml/2006/wordprocessingDrawing" xmlns:w10="urn:schemas-microsoft-com:office:word" xmlns:w="http://schemas.openxmlformats.org/wordprocessingml/2006/main" xmlns:w14="http://schemas.microsoft.com/office/word/2010/wordml" xmlns:w15="http://schemas.microsoft.com/office/word/2012/wordml" xmlns:w16cex="http://schemas.microsoft.com/office/word/2018/wordml/cex" xmlns:w16cid="http://schemas.microsoft.com/office/word/2016/wordml/cid" xmlns:w16="http://schemas.microsoft.com/office/word/2018/wordml" xmlns:w16du="http://schemas.microsoft.com/office/word/2023/wordml/word16du" xmlns:w16sdtdh="http://schemas.microsoft.com/office/word/2020/wordml/sdtdatahash" xmlns:w16sdtfl="http://schemas.microsoft.com/office/word/2024/wordml/sdtformatlock" xmlns:w16se="http://schemas.microsoft.com/office/word/2015/wordml/symex" xmlns:wpg="http://schemas.microsoft.com/office/word/2010/wordprocessingGroup" xmlns:wpi="http://schemas.microsoft.com/office/word/2010/wordprocessingInk" xmlns:wne="http://schemas.microsoft.com/office/word/2006/wordml" xmlns:wps="http://schemas.microsoft.com/office/word/2010/wordprocessingShape" mc:Ignorable="w14 w15 w16se w16cid w16 w16cex w16sdtdh w16sdtfl w16du wp14">
   <w:body>
-    <w:p>
-      <w:pPr>
-        <w:rPr>
-          <w:b/>
-          <w:bCs/>
-        </w:rPr>
-      </w:pPr>
-      <w:r>
-        <w:rPr>
-          <w:b/>
-          <w:bCs/>
-        </w:rPr>
-        <w:t xml:space="preserve">3.x Subsystem: </w:t>
-      </w:r>
-      <w:proofErr w:type="spellStart"/>
-      <w:r>
-        <w:rPr>
-          <w:b/>
-          <w:bCs/>
-        </w:rPr>
-        <w:t>AccountControl</w:t>
-      </w:r>
-      <w:proofErr w:type="spellEnd"/>
-    </w:p>
-    <w:p>
-      <w:r>
-        <w:t xml:space="preserve">Il </w:t>
-      </w:r>
-      <w:proofErr w:type="spellStart"/>
-      <w:r>
-        <w:t>subsystem</w:t>
-      </w:r>
-      <w:proofErr w:type="spellEnd"/>
-      <w:r>
-        <w:t xml:space="preserve"> </w:t>
-      </w:r>
-      <w:proofErr w:type="spellStart"/>
-      <w:r>
-        <w:t>AccountControl</w:t>
-      </w:r>
-      <w:proofErr w:type="spellEnd"/>
-      <w:r>
-        <w:t xml:space="preserve"> s</w:t>
-      </w:r>
-      <w:r>
-        <w:t xml:space="preserve">i occupa di gestire la logica di controllo legata agli account gestisce quindi l’interazione con i </w:t>
-      </w:r>
-      <w:proofErr w:type="spellStart"/>
-      <w:r>
-        <w:t>subsystem</w:t>
-      </w:r>
-      <w:proofErr w:type="spellEnd"/>
-      <w:r>
-        <w:t xml:space="preserve"> </w:t>
-      </w:r>
-      <w:proofErr w:type="spellStart"/>
-      <w:r>
-        <w:t>AccessManagement</w:t>
-      </w:r>
-      <w:proofErr w:type="spellEnd"/>
-      <w:r>
-        <w:t xml:space="preserve"> e </w:t>
-      </w:r>
-      <w:proofErr w:type="spellStart"/>
-      <w:r>
-        <w:t>AccountManagement</w:t>
-      </w:r>
-      <w:proofErr w:type="spellEnd"/>
-      <w:r>
-        <w:t>.</w:t>
-      </w:r>
-    </w:p>
-    <w:p/>
-    <w:p/>
-    <w:p>
-      <w:r>
-        <w:t xml:space="preserve">3.x.1 </w:t>
-      </w:r>
-      <w:proofErr w:type="spellStart"/>
-      <w:r>
-        <w:t>Login_control</w:t>
-      </w:r>
-      <w:proofErr w:type="spellEnd"/>
-    </w:p>
-    <w:p>
-      <w:r>
-        <w:t>Descrizione:</w:t>
-      </w:r>
-    </w:p>
-    <w:p>
-      <w:proofErr w:type="spellStart"/>
-      <w:r>
-        <w:t>Servlet</w:t>
-      </w:r>
-      <w:proofErr w:type="spellEnd"/>
-      <w:r>
-        <w:t xml:space="preserve"> per la gestione del controllo per il login dell’utente.</w:t>
-      </w:r>
-    </w:p>
-    <w:p/>
-    <w:p>
-      <w:r>
-        <w:t>Attributi:</w:t>
-      </w:r>
-    </w:p>
-    <w:p>
-      <w:proofErr w:type="spellStart"/>
-      <w:r>
-        <w:t>sessionService</w:t>
-      </w:r>
-      <w:proofErr w:type="spellEnd"/>
-      <w:r>
-        <w:t xml:space="preserve"> : </w:t>
-      </w:r>
-      <w:proofErr w:type="spellStart"/>
-      <w:r>
-        <w:t>SessionService</w:t>
-      </w:r>
-      <w:proofErr w:type="spellEnd"/>
-    </w:p>
-    <w:p>
-      <w:pPr>
-        <w:pStyle w:val="Paragrafoelenco"/>
-        <w:numPr>
-          <w:ilvl w:val="0"/>
-          <w:numId w:val="6"/>
-        </w:numPr>
-      </w:pPr>
-      <w:r>
-        <w:t xml:space="preserve">Descrizione: Riferimento all’oggetto </w:t>
-      </w:r>
-      <w:proofErr w:type="spellStart"/>
-      <w:r>
-        <w:t>SessionService</w:t>
-      </w:r>
-      <w:proofErr w:type="spellEnd"/>
-      <w:r>
-        <w:t xml:space="preserve"> che offre il servizio di login.</w:t>
-      </w:r>
-    </w:p>
-    <w:p/>
-    <w:p>
-      <w:pPr>
-        <w:pBdr>
-          <w:bottom w:val="single" w:sz="6" w:space="1" w:color="auto"/>
-        </w:pBdr>
-      </w:pPr>
-    </w:p>
     <w:p>
       <w:r>
         <w:t xml:space="preserve">3.x.1 </w:t>
@@ -804,7 +656,6 @@
               <w:rPr>
                 <w:lang w:val="en-GB"/>
               </w:rPr>
-              <w:lastRenderedPageBreak/>
               <w:t>HttpSession.getParamenter</w:t>
             </w:r>
             <w:proofErr w:type="spellEnd"/>
@@ -841,7 +692,6 @@
               <w:spacing w:after="160" w:line="259" w:lineRule="auto"/>
             </w:pPr>
             <w:r>
-              <w:lastRenderedPageBreak/>
               <w:t>Post-condizione</w:t>
             </w:r>
           </w:p>
@@ -1208,6 +1058,7 @@
               <w:spacing w:after="160" w:line="259" w:lineRule="auto"/>
             </w:pPr>
             <w:r>
+              <w:lastRenderedPageBreak/>
               <w:t>Firma metodo</w:t>
             </w:r>
           </w:p>

</xml_diff>

<commit_message>
Mod: modificato il file per le interfacce del persistance Management subsystem
</commit_message>
<xml_diff>
--- a/Workspace/ODD/punti singoli/Interface specification - Access.docx
+++ b/Workspace/ODD/punti singoli/Interface specification - Access.docx
@@ -4,13 +4,8 @@
   <w:body>
     <w:p>
       <w:r>
-        <w:t xml:space="preserve">3.x.1 </w:t>
+        <w:t>3.x.1 SessionService</w:t>
       </w:r>
-      <w:proofErr w:type="spellStart"/>
-      <w:r>
-        <w:t>SessionService</w:t>
-      </w:r>
-      <w:proofErr w:type="spellEnd"/>
     </w:p>
     <w:p>
       <w:pPr>
@@ -48,11 +43,9 @@
             <w:tcW w:w="7932" w:type="dxa"/>
           </w:tcPr>
           <w:p>
-            <w:proofErr w:type="spellStart"/>
             <w:r>
               <w:t>SessionService</w:t>
             </w:r>
-            <w:proofErr w:type="spellEnd"/>
           </w:p>
         </w:tc>
       </w:tr>
@@ -79,40 +72,11 @@
               <w:t xml:space="preserve"> </w:t>
             </w:r>
             <w:r>
-              <w:t xml:space="preserve">che incapsula la logica di business relativa all'autenticazione e all'autorizzazione. Interagisce con il </w:t>
-            </w:r>
-            <w:proofErr w:type="spellStart"/>
-            <w:r>
-              <w:t>persistence</w:t>
-            </w:r>
-            <w:proofErr w:type="spellEnd"/>
-            <w:r>
-              <w:t xml:space="preserve"> </w:t>
-            </w:r>
-            <w:proofErr w:type="spellStart"/>
-            <w:r>
-              <w:t>layer</w:t>
-            </w:r>
-            <w:proofErr w:type="spellEnd"/>
-            <w:r>
-              <w:t xml:space="preserve"> (tramite </w:t>
-            </w:r>
-            <w:proofErr w:type="spellStart"/>
-            <w:r>
-              <w:t>CatalogoUtenti</w:t>
-            </w:r>
-            <w:proofErr w:type="spellEnd"/>
-            <w:r>
-              <w:t xml:space="preserve">) per la verifica delle credenziali e gestisce lo stato della </w:t>
-            </w:r>
-            <w:proofErr w:type="spellStart"/>
-            <w:r>
-              <w:t>HttpSessio</w:t>
+              <w:t>che incapsula la logica di business relativa all'autenticazione e all'autorizzazione. Interagisce con il persistence layer (tramite CatalogoUtenti) per la verifica delle credenziali e gestisce lo stato della HttpSessio</w:t>
             </w:r>
             <w:r>
               <w:t>n</w:t>
             </w:r>
-            <w:proofErr w:type="spellEnd"/>
             <w:r>
               <w:t>.</w:t>
             </w:r>
@@ -157,99 +121,21 @@
               <w:rPr>
                 <w:lang w:val="en-GB"/>
               </w:rPr>
-              <w:t>+ logout(</w:t>
-            </w:r>
-            <w:proofErr w:type="spellStart"/>
-            <w:r>
-              <w:rPr>
-                <w:lang w:val="en-GB"/>
-              </w:rPr>
-              <w:t>currentSession</w:t>
-            </w:r>
-            <w:proofErr w:type="spellEnd"/>
-            <w:r>
-              <w:rPr>
-                <w:lang w:val="en-GB"/>
-              </w:rPr>
-              <w:t xml:space="preserve">: </w:t>
-            </w:r>
-            <w:proofErr w:type="spellStart"/>
-            <w:r>
-              <w:rPr>
-                <w:lang w:val="en-GB"/>
-              </w:rPr>
-              <w:t>HttpSession</w:t>
-            </w:r>
-            <w:proofErr w:type="spellEnd"/>
-            <w:r>
-              <w:rPr>
-                <w:lang w:val="en-GB"/>
-              </w:rPr>
-              <w:t>): void</w:t>
-            </w:r>
-          </w:p>
-          <w:p>
-            <w:pPr>
-              <w:rPr>
-                <w:lang w:val="en-GB"/>
-              </w:rPr>
-            </w:pPr>
-            <w:r>
-              <w:rPr>
-                <w:lang w:val="en-GB"/>
-              </w:rPr>
-              <w:t xml:space="preserve">+ </w:t>
-            </w:r>
-            <w:proofErr w:type="spellStart"/>
-            <w:r>
-              <w:rPr>
-                <w:lang w:val="en-GB"/>
-              </w:rPr>
-              <w:t>checkPermission</w:t>
-            </w:r>
-            <w:proofErr w:type="spellEnd"/>
-            <w:r>
-              <w:rPr>
-                <w:lang w:val="en-GB"/>
-              </w:rPr>
-              <w:t xml:space="preserve">(user: </w:t>
-            </w:r>
-            <w:proofErr w:type="spellStart"/>
-            <w:r>
-              <w:rPr>
-                <w:lang w:val="en-GB"/>
-              </w:rPr>
-              <w:t>Utente</w:t>
-            </w:r>
-            <w:proofErr w:type="spellEnd"/>
-            <w:r>
-              <w:rPr>
-                <w:lang w:val="en-GB"/>
-              </w:rPr>
-              <w:t xml:space="preserve">, </w:t>
-            </w:r>
-            <w:proofErr w:type="spellStart"/>
-            <w:r>
-              <w:rPr>
-                <w:lang w:val="en-GB"/>
-              </w:rPr>
-              <w:t>requiredRole</w:t>
-            </w:r>
-            <w:proofErr w:type="spellEnd"/>
-            <w:r>
-              <w:rPr>
-                <w:lang w:val="en-GB"/>
-              </w:rPr>
-              <w:t xml:space="preserve">: Role): </w:t>
-            </w:r>
-            <w:proofErr w:type="spellStart"/>
-            <w:r>
-              <w:rPr>
-                <w:lang w:val="en-GB"/>
-              </w:rPr>
-              <w:t>boolean</w:t>
-            </w:r>
-            <w:proofErr w:type="spellEnd"/>
+              <w:t>+ logout(currentSession: HttpSession): void</w:t>
+            </w:r>
+          </w:p>
+          <w:p>
+            <w:pPr>
+              <w:rPr>
+                <w:lang w:val="en-GB"/>
+              </w:rPr>
+            </w:pPr>
+            <w:r>
+              <w:rPr>
+                <w:lang w:val="en-GB"/>
+              </w:rPr>
+              <w:t>+ checkPermission(user: Utente, requiredRole: Role): boolean</w:t>
+            </w:r>
           </w:p>
         </w:tc>
       </w:tr>
@@ -361,28 +247,18 @@
                 <w:lang w:val="en-GB"/>
               </w:rPr>
             </w:pPr>
-            <w:proofErr w:type="spellStart"/>
             <w:r>
               <w:rPr>
                 <w:lang w:val="en-GB"/>
               </w:rPr>
               <w:t>Context:</w:t>
             </w:r>
-            <w:proofErr w:type="gramStart"/>
-            <w:r>
-              <w:rPr>
-                <w:lang w:val="en-GB"/>
-              </w:rPr>
-              <w:t>SessionService</w:t>
-            </w:r>
-            <w:proofErr w:type="spellEnd"/>
-            <w:r>
-              <w:rPr>
-                <w:lang w:val="en-GB"/>
-              </w:rPr>
-              <w:t>::</w:t>
-            </w:r>
-            <w:proofErr w:type="gramEnd"/>
+            <w:r>
+              <w:rPr>
+                <w:lang w:val="en-GB"/>
+              </w:rPr>
+              <w:t>SessionService::</w:t>
+            </w:r>
             <w:r>
               <w:rPr>
                 <w:lang w:val="en-GB"/>
@@ -426,42 +302,19 @@
                 <w:lang w:val="en-GB"/>
               </w:rPr>
             </w:pPr>
-            <w:proofErr w:type="spellStart"/>
-            <w:r>
-              <w:rPr>
-                <w:lang w:val="en-GB"/>
-              </w:rPr>
-              <w:t>Context:</w:t>
-            </w:r>
-            <w:proofErr w:type="gramStart"/>
-            <w:r>
-              <w:rPr>
-                <w:lang w:val="en-GB"/>
-              </w:rPr>
-              <w:t>SessionService</w:t>
-            </w:r>
-            <w:proofErr w:type="spellEnd"/>
-            <w:r>
-              <w:rPr>
-                <w:lang w:val="en-GB"/>
-              </w:rPr>
-              <w:t>::</w:t>
-            </w:r>
-            <w:proofErr w:type="gramEnd"/>
-            <w:r>
-              <w:rPr>
-                <w:lang w:val="en-GB"/>
-              </w:rPr>
-              <w:t>login</w:t>
-            </w:r>
-          </w:p>
-          <w:p>
-            <w:pPr>
-              <w:rPr>
-                <w:lang w:val="en-GB"/>
-              </w:rPr>
-            </w:pPr>
-            <w:proofErr w:type="spellStart"/>
+            <w:r>
+              <w:rPr>
+                <w:lang w:val="en-GB"/>
+              </w:rPr>
+              <w:t>Context:SessionService::login</w:t>
+            </w:r>
+          </w:p>
+          <w:p>
+            <w:pPr>
+              <w:rPr>
+                <w:lang w:val="en-GB"/>
+              </w:rPr>
+            </w:pPr>
             <w:r>
               <w:rPr>
                 <w:lang w:val="en-GB"/>
@@ -472,28 +325,7 @@
               <w:rPr>
                 <w:lang w:val="en-GB"/>
               </w:rPr>
-              <w:t>etParameter</w:t>
-            </w:r>
-            <w:proofErr w:type="spellEnd"/>
-            <w:r>
-              <w:rPr>
-                <w:lang w:val="en-GB"/>
-              </w:rPr>
-              <w:t>(“</w:t>
-            </w:r>
-            <w:proofErr w:type="spellStart"/>
-            <w:r>
-              <w:rPr>
-                <w:lang w:val="en-GB"/>
-              </w:rPr>
-              <w:t>utente</w:t>
-            </w:r>
-            <w:proofErr w:type="spellEnd"/>
-            <w:r>
-              <w:rPr>
-                <w:lang w:val="en-GB"/>
-              </w:rPr>
-              <w:t>”) != null</w:t>
+              <w:t>etParameter(“utente”) != null</w:t>
             </w:r>
           </w:p>
         </w:tc>
@@ -539,29 +371,8 @@
               <w:spacing w:after="160" w:line="259" w:lineRule="auto"/>
             </w:pPr>
             <w:r>
-              <w:t>+ logout(</w:t>
-            </w:r>
-            <w:proofErr w:type="spellStart"/>
-            <w:r>
-              <w:t>currentSession</w:t>
-            </w:r>
-            <w:proofErr w:type="spellEnd"/>
-            <w:r>
-              <w:t xml:space="preserve">: </w:t>
-            </w:r>
-            <w:proofErr w:type="spellStart"/>
-            <w:r>
-              <w:t>HttpSession</w:t>
-            </w:r>
-            <w:proofErr w:type="spellEnd"/>
-            <w:r>
-              <w:t xml:space="preserve">): </w:t>
-            </w:r>
-            <w:proofErr w:type="spellStart"/>
-            <w:r>
-              <w:t>void</w:t>
-            </w:r>
-            <w:proofErr w:type="spellEnd"/>
+              <w:t>+ logout(currentSession: HttpSession): void</w:t>
+            </w:r>
           </w:p>
         </w:tc>
       </w:tr>
@@ -615,33 +426,11 @@
                 <w:lang w:val="en-GB"/>
               </w:rPr>
             </w:pPr>
-            <w:proofErr w:type="spellStart"/>
-            <w:r>
-              <w:rPr>
-                <w:lang w:val="en-GB"/>
-              </w:rPr>
-              <w:t>Context:</w:t>
-            </w:r>
-            <w:proofErr w:type="gramStart"/>
-            <w:r>
-              <w:rPr>
-                <w:lang w:val="en-GB"/>
-              </w:rPr>
-              <w:t>SessionService</w:t>
-            </w:r>
-            <w:proofErr w:type="spellEnd"/>
-            <w:r>
-              <w:rPr>
-                <w:lang w:val="en-GB"/>
-              </w:rPr>
-              <w:t>::</w:t>
-            </w:r>
-            <w:proofErr w:type="gramEnd"/>
-            <w:r>
-              <w:rPr>
-                <w:lang w:val="en-GB"/>
-              </w:rPr>
-              <w:t>logout</w:t>
+            <w:r>
+              <w:rPr>
+                <w:lang w:val="en-GB"/>
+              </w:rPr>
+              <w:t>Context:SessionService::logout</w:t>
             </w:r>
           </w:p>
           <w:p>
@@ -651,33 +440,11 @@
                 <w:lang w:val="en-GB"/>
               </w:rPr>
             </w:pPr>
-            <w:proofErr w:type="spellStart"/>
-            <w:r>
-              <w:rPr>
-                <w:lang w:val="en-GB"/>
-              </w:rPr>
-              <w:t>HttpSession.getParamenter</w:t>
-            </w:r>
-            <w:proofErr w:type="spellEnd"/>
-            <w:r>
-              <w:rPr>
-                <w:lang w:val="en-GB"/>
-              </w:rPr>
-              <w:t>(“</w:t>
-            </w:r>
-            <w:proofErr w:type="spellStart"/>
-            <w:r>
-              <w:rPr>
-                <w:lang w:val="en-GB"/>
-              </w:rPr>
-              <w:t>utente</w:t>
-            </w:r>
-            <w:proofErr w:type="spellEnd"/>
-            <w:r>
-              <w:rPr>
-                <w:lang w:val="en-GB"/>
-              </w:rPr>
-              <w:t>”) != null</w:t>
+            <w:r>
+              <w:rPr>
+                <w:lang w:val="en-GB"/>
+              </w:rPr>
+              <w:t>HttpSession.getParamenter(“utente”) != null</w:t>
             </w:r>
           </w:p>
         </w:tc>
@@ -707,33 +474,11 @@
                 <w:lang w:val="en-GB"/>
               </w:rPr>
             </w:pPr>
-            <w:proofErr w:type="spellStart"/>
-            <w:r>
-              <w:rPr>
-                <w:lang w:val="en-GB"/>
-              </w:rPr>
-              <w:t>Context:</w:t>
-            </w:r>
-            <w:proofErr w:type="gramStart"/>
-            <w:r>
-              <w:rPr>
-                <w:lang w:val="en-GB"/>
-              </w:rPr>
-              <w:t>SessionService</w:t>
-            </w:r>
-            <w:proofErr w:type="spellEnd"/>
-            <w:r>
-              <w:rPr>
-                <w:lang w:val="en-GB"/>
-              </w:rPr>
-              <w:t>::</w:t>
-            </w:r>
-            <w:proofErr w:type="gramEnd"/>
-            <w:r>
-              <w:rPr>
-                <w:lang w:val="en-GB"/>
-              </w:rPr>
-              <w:t>logout</w:t>
+            <w:r>
+              <w:rPr>
+                <w:lang w:val="en-GB"/>
+              </w:rPr>
+              <w:t>Context:SessionService::logout</w:t>
             </w:r>
           </w:p>
           <w:p>
@@ -743,33 +488,11 @@
                 <w:lang w:val="en-GB"/>
               </w:rPr>
             </w:pPr>
-            <w:proofErr w:type="spellStart"/>
-            <w:r>
-              <w:rPr>
-                <w:lang w:val="en-GB"/>
-              </w:rPr>
-              <w:t>HttpSession.getParamenter</w:t>
-            </w:r>
-            <w:proofErr w:type="spellEnd"/>
-            <w:r>
-              <w:rPr>
-                <w:lang w:val="en-GB"/>
-              </w:rPr>
-              <w:t>(“</w:t>
-            </w:r>
-            <w:proofErr w:type="spellStart"/>
-            <w:r>
-              <w:rPr>
-                <w:lang w:val="en-GB"/>
-              </w:rPr>
-              <w:t>utente</w:t>
-            </w:r>
-            <w:proofErr w:type="spellEnd"/>
-            <w:r>
-              <w:rPr>
-                <w:lang w:val="en-GB"/>
-              </w:rPr>
-              <w:t xml:space="preserve">”) </w:t>
+            <w:r>
+              <w:rPr>
+                <w:lang w:val="en-GB"/>
+              </w:rPr>
+              <w:t xml:space="preserve">HttpSession.getParamenter(“utente”) </w:t>
             </w:r>
             <w:r>
               <w:rPr>
@@ -847,28 +570,7 @@
               <w:rPr>
                 <w:lang w:val="en-GB"/>
               </w:rPr>
-              <w:t xml:space="preserve">+ </w:t>
-            </w:r>
-            <w:proofErr w:type="spellStart"/>
-            <w:r>
-              <w:rPr>
-                <w:lang w:val="en-GB"/>
-              </w:rPr>
-              <w:t>checkPermission</w:t>
-            </w:r>
-            <w:proofErr w:type="spellEnd"/>
-            <w:r>
-              <w:rPr>
-                <w:lang w:val="en-GB"/>
-              </w:rPr>
-              <w:t>(</w:t>
-            </w:r>
-            <w:proofErr w:type="spellStart"/>
-            <w:r>
-              <w:rPr>
-                <w:lang w:val="en-GB"/>
-              </w:rPr>
-              <w:t>u</w:t>
+              <w:t>+ checkPermission(u</w:t>
             </w:r>
             <w:r>
               <w:rPr>
@@ -888,35 +590,12 @@
               </w:rPr>
               <w:t>nte</w:t>
             </w:r>
-            <w:proofErr w:type="spellEnd"/>
-            <w:r>
-              <w:rPr>
-                <w:lang w:val="en-GB"/>
-              </w:rPr>
-              <w:t xml:space="preserve">: </w:t>
-            </w:r>
-            <w:proofErr w:type="spellStart"/>
-            <w:r>
-              <w:rPr>
-                <w:lang w:val="en-GB"/>
-              </w:rPr>
-              <w:t>Utente</w:t>
-            </w:r>
-            <w:proofErr w:type="spellEnd"/>
-            <w:r>
-              <w:rPr>
-                <w:lang w:val="en-GB"/>
-              </w:rPr>
-              <w:t xml:space="preserve">, </w:t>
-            </w:r>
-            <w:proofErr w:type="spellStart"/>
-            <w:r>
-              <w:rPr>
-                <w:lang w:val="en-GB"/>
-              </w:rPr>
-              <w:t>requiredRole</w:t>
-            </w:r>
-            <w:proofErr w:type="spellEnd"/>
+            <w:r>
+              <w:rPr>
+                <w:lang w:val="en-GB"/>
+              </w:rPr>
+              <w:t>: Utente, requiredRole</w:t>
+            </w:r>
             <w:r>
               <w:rPr>
                 <w:lang w:val="en-GB"/>
@@ -927,16 +606,8 @@
               <w:rPr>
                 <w:lang w:val="en-GB"/>
               </w:rPr>
-              <w:t xml:space="preserve">): </w:t>
-            </w:r>
-            <w:proofErr w:type="spellStart"/>
-            <w:r>
-              <w:rPr>
-                <w:lang w:val="en-GB"/>
-              </w:rPr>
-              <w:t>boolean</w:t>
-            </w:r>
-            <w:proofErr w:type="spellEnd"/>
+              <w:t>): boolean</w:t>
+            </w:r>
           </w:p>
         </w:tc>
       </w:tr>
@@ -1013,24 +684,11 @@
               <w:spacing w:after="160" w:line="259" w:lineRule="auto"/>
             </w:pPr>
             <w:r>
-              <w:t xml:space="preserve">Ritorna </w:t>
-            </w:r>
-            <w:proofErr w:type="spellStart"/>
-            <w:r>
-              <w:t>true</w:t>
-            </w:r>
-            <w:proofErr w:type="spellEnd"/>
-            <w:r>
-              <w:t xml:space="preserve"> se il ruolo dell'utente corrisponde</w:t>
-            </w:r>
-            <w:r>
-              <w:t xml:space="preserve"> a </w:t>
-            </w:r>
-            <w:proofErr w:type="spellStart"/>
-            <w:r>
-              <w:t>requiredRole</w:t>
-            </w:r>
-            <w:proofErr w:type="spellEnd"/>
+              <w:t>Ritorna true se il ruolo dell'utente corrisponde</w:t>
+            </w:r>
+            <w:r>
+              <w:t xml:space="preserve"> a requiredRole</w:t>
+            </w:r>
           </w:p>
         </w:tc>
       </w:tr>

</xml_diff>